<commit_message>
test/docs: add Sprint 1A E2E suite, validation docs, and debug scripts
Adds Playwright page objects, specs and workflows for Sprint 1A flows
(auth recovery, admin management, Path A, student results, college
integrity), plus archived docs, validation reports and demo guide.

Co-Authored-By: Claude Opus 4.8 <noreply@anthropic.com>
</commit_message>
<xml_diff>
--- a/docs/GradLogic-Feature-Overview.docx
+++ b/docs/GradLogic-Feature-Overview.docx
@@ -10,6 +10,9 @@
     <w:p>
       <w:pPr>
         <w:jc w:val="center"/>
+        <w:rPr>
+          <w:sz w:val="60"/>
+        </w:rPr>
       </w:pPr>
       <w:r>
         <w:rPr>
@@ -17,7 +20,7 @@
           <w:bCs/>
           <w:color w:val="4F46E5"/>
           <w:spacing w:val="40"/>
-          <w:sz w:val="30"/>
+          <w:sz w:val="60"/>
           <w:szCs w:val="30"/>
         </w:rPr>
         <w:t>GRADLOGIC</w:t>
@@ -27,31 +30,37 @@
       <w:pPr>
         <w:spacing w:before="220" w:after="80"/>
         <w:jc w:val="center"/>
+        <w:rPr>
+          <w:sz w:val="32"/>
+        </w:rPr>
+      </w:pPr>
+      <w:r>
+        <w:rPr>
+          <w:b/>
+          <w:bCs/>
+          <w:caps/>
+          <w:color w:val="4F46E5"/>
+          <w:spacing w:val="20"/>
+          <w:sz w:val="32"/>
+        </w:rPr>
+        <w:t>AI-Powered Talent Development Platform</w:t>
+      </w:r>
+    </w:p>
+    <w:p>
+      <w:pPr>
+        <w:spacing w:before="140" w:after="100"/>
+        <w:jc w:val="center"/>
+        <w:rPr>
+          <w:color w:val="4F46E5"/>
+          <w:sz w:val="26"/>
+        </w:rPr>
       </w:pPr>
       <w:r>
         <w:rPr>
           <w:b/>
           <w:bCs/>
           <w:color w:val="4F46E5"/>
-          <w:sz w:val="20"/>
-          <w:szCs w:val="20"/>
-          <w:caps/>
-          <w:spacing w:val="20"/>
-        </w:rPr>
-        <w:t>AI-Powered Talent Development Platform</w:t>
-      </w:r>
-    </w:p>
-    <w:p>
-      <w:pPr>
-        <w:spacing w:before="140" w:after="100"/>
-        <w:jc w:val="center"/>
-      </w:pPr>
-      <w:r>
-        <w:rPr>
-          <w:b/>
-          <w:bCs/>
-          <w:color w:val="1E293B"/>
-          <w:sz w:val="38"/>
+          <w:sz w:val="26"/>
           <w:szCs w:val="38"/>
         </w:rPr>
         <w:t>Learn. Practice. Get Assessed. Become Placement Ready.</w:t>
@@ -96,20 +105,42 @@
           <w:sz w:val="30"/>
           <w:szCs w:val="30"/>
         </w:rPr>
-        <w:t>What Is GradLogic</w:t>
-      </w:r>
+        <w:t xml:space="preserve">What Is </w:t>
+      </w:r>
+      <w:proofErr w:type="spellStart"/>
+      <w:r>
+        <w:rPr>
+          <w:b/>
+          <w:bCs/>
+          <w:color w:val="1E293B"/>
+          <w:sz w:val="30"/>
+          <w:szCs w:val="30"/>
+        </w:rPr>
+        <w:t>GradLogic</w:t>
+      </w:r>
+      <w:proofErr w:type="spellEnd"/>
     </w:p>
     <w:p>
       <w:pPr>
         <w:spacing w:after="140" w:line="300" w:lineRule="auto"/>
       </w:pPr>
-      <w:r>
-        <w:rPr>
-          <w:color w:val="1E293B"/>
-          <w:sz w:val="21"/>
-          <w:szCs w:val="21"/>
-        </w:rPr>
-        <w:t>GradLogic is an end-to-end, AI-powered talent development platform. It takes a student from “has a degree” to “is interview-ready and connected to hiring companies” — aptitude and reasoning practice, AI-generated assessments, proctored exams, voice-based mock interviews, soft-skills training, and a direct pipeline into placement drives — all in one system the college administers and the student uses daily.</w:t>
+      <w:proofErr w:type="spellStart"/>
+      <w:r>
+        <w:rPr>
+          <w:color w:val="1E293B"/>
+          <w:sz w:val="21"/>
+          <w:szCs w:val="21"/>
+        </w:rPr>
+        <w:t>GradLogic</w:t>
+      </w:r>
+      <w:proofErr w:type="spellEnd"/>
+      <w:r>
+        <w:rPr>
+          <w:color w:val="1E293B"/>
+          <w:sz w:val="21"/>
+          <w:szCs w:val="21"/>
+        </w:rPr>
+        <w:t xml:space="preserve"> is an end-to-end, AI-powered talent development platform. It takes a student from “has a degree” to “is interview-ready and connected to hiring companies” — aptitude and reasoning practice, AI-generated assessments, proctored exams, voice-based mock interviews, soft-skills training, and a direct pipeline into placement drives — all in one system the college administers and the student uses daily.</w:t>
       </w:r>
     </w:p>
     <w:p>
@@ -197,7 +228,23 @@
           <w:sz w:val="21"/>
           <w:szCs w:val="21"/>
         </w:rPr>
-        <w:t>Sending students home with a Google Form for a “online test” means the TPO has no idea who actually took it, or with whose help.</w:t>
+        <w:t>Sending students home with a Google Form for a</w:t>
+      </w:r>
+      <w:r>
+        <w:rPr>
+          <w:color w:val="1E293B"/>
+          <w:sz w:val="21"/>
+          <w:szCs w:val="21"/>
+        </w:rPr>
+        <w:t>n</w:t>
+      </w:r>
+      <w:r>
+        <w:rPr>
+          <w:color w:val="1E293B"/>
+          <w:sz w:val="21"/>
+          <w:szCs w:val="21"/>
+        </w:rPr>
+        <w:t xml:space="preserve"> “online test” means the TPO has no idea who actually took it, or with whose help.</w:t>
       </w:r>
     </w:p>
     <w:p>
@@ -272,50 +319,48 @@
           <w:sz w:val="30"/>
           <w:szCs w:val="30"/>
         </w:rPr>
-        <w:t>What Makes GradLogic Different</w:t>
-      </w:r>
-    </w:p>
-    <w:p>
-      <w:pPr>
-        <w:spacing w:before="220" w:after="60"/>
-      </w:pPr>
+        <w:t xml:space="preserve">What Makes </w:t>
+      </w:r>
+      <w:proofErr w:type="spellStart"/>
       <w:r>
         <w:rPr>
           <w:b/>
           <w:bCs/>
+          <w:color w:val="1E293B"/>
+          <w:sz w:val="30"/>
+          <w:szCs w:val="30"/>
+        </w:rPr>
+        <w:t>GradLogic</w:t>
+      </w:r>
+      <w:proofErr w:type="spellEnd"/>
+      <w:r>
+        <w:rPr>
+          <w:b/>
+          <w:bCs/>
+          <w:color w:val="1E293B"/>
+          <w:sz w:val="30"/>
+          <w:szCs w:val="30"/>
+        </w:rPr>
+        <w:t xml:space="preserve"> Different</w:t>
+      </w:r>
+    </w:p>
+    <w:p>
+      <w:pPr>
+        <w:pStyle w:val="Heading2"/>
+        <w:spacing w:before="200" w:after="80"/>
+        <w:rPr>
+          <w:b/>
           <w:color w:val="4F46E5"/>
           <w:sz w:val="23"/>
-          <w:szCs w:val="23"/>
-        </w:rPr>
-        <w:t>AI-generated question banks, not static pools</w:t>
-      </w:r>
-    </w:p>
-    <w:p>
-      <w:pPr>
-        <w:spacing w:after="140" w:line="300" w:lineRule="auto"/>
-      </w:pPr>
-      <w:r>
-        <w:rPr>
-          <w:color w:val="1E293B"/>
-          <w:sz w:val="21"/>
-          <w:szCs w:val="21"/>
-        </w:rPr>
-        <w:t>An in-house RAG engine (ChromaDB + LLM) ingests reference material and generates fresh aptitude, reasoning, and domain questions on demand, reviewed by staff before publishing — instead of recycling the same 500 questions every cohort has already memorized.</w:t>
-      </w:r>
-    </w:p>
-    <w:p>
-      <w:pPr>
-        <w:spacing w:before="220" w:after="60"/>
-      </w:pPr>
-      <w:r>
-        <w:rPr>
-          <w:b/>
-          <w:bCs/>
+        </w:rPr>
+      </w:pPr>
+      <w:r>
+        <w:rPr>
+          <w:b/>
           <w:color w:val="4F46E5"/>
           <w:sz w:val="23"/>
-          <w:szCs w:val="23"/>
-        </w:rPr>
-        <w:t>Proctoring that actually catches cheating</w:t>
+        </w:rPr>
+        <w:t>AI-generated question banks, not static pools</w:t>
       </w:r>
     </w:p>
     <w:p>
@@ -328,50 +373,44 @@
           <w:sz w:val="21"/>
           <w:szCs w:val="21"/>
         </w:rPr>
-        <w:t>Live exams monitor for face-not-detected, multiple faces, face mismatch, tab switching, browser minimizing, copy-paste, right-click, screen sharing, devtools, external displays, and network anomalies — each weighted into a per-student risk score the college can review, not a simple pass/fail flag.</w:t>
-      </w:r>
-    </w:p>
-    <w:p>
-      <w:pPr>
-        <w:spacing w:before="220" w:after="60"/>
-      </w:pPr>
-      <w:r>
-        <w:rPr>
-          <w:b/>
-          <w:bCs/>
+        <w:t>An in-house RAG engine (</w:t>
+      </w:r>
+      <w:proofErr w:type="spellStart"/>
+      <w:r>
+        <w:rPr>
+          <w:color w:val="1E293B"/>
+          <w:sz w:val="21"/>
+          <w:szCs w:val="21"/>
+        </w:rPr>
+        <w:t>ChromaDB</w:t>
+      </w:r>
+      <w:proofErr w:type="spellEnd"/>
+      <w:r>
+        <w:rPr>
+          <w:color w:val="1E293B"/>
+          <w:sz w:val="21"/>
+          <w:szCs w:val="21"/>
+        </w:rPr>
+        <w:t xml:space="preserve"> + LLM) ingests reference material and generates fresh aptitude, reasoning, and domain questions on demand, reviewed by staff before publishing — instead of recycling the same 500 questions every cohort has already memorized.</w:t>
+      </w:r>
+    </w:p>
+    <w:p>
+      <w:pPr>
+        <w:pStyle w:val="Heading2"/>
+        <w:spacing w:before="200" w:after="80"/>
+        <w:rPr>
+          <w:b/>
           <w:color w:val="4F46E5"/>
           <w:sz w:val="23"/>
-          <w:szCs w:val="23"/>
-        </w:rPr>
-        <w:t>Voice AI mock interviews, not just MCQs</w:t>
-      </w:r>
-    </w:p>
-    <w:p>
-      <w:pPr>
-        <w:spacing w:after="140" w:line="300" w:lineRule="auto"/>
-      </w:pPr>
-      <w:r>
-        <w:rPr>
-          <w:color w:val="1E293B"/>
-          <w:sz w:val="21"/>
-          <w:szCs w:val="21"/>
-        </w:rPr>
-        <w:t>Students practice real spoken interviews with an AI interviewer and get structured feedback — the missing link between “scored well on the aptitude test” and “can perform in front of a recruiter.”</w:t>
-      </w:r>
-    </w:p>
-    <w:p>
-      <w:pPr>
-        <w:spacing w:before="220" w:after="60"/>
-      </w:pPr>
-      <w:r>
-        <w:rPr>
-          <w:b/>
-          <w:bCs/>
+        </w:rPr>
+      </w:pPr>
+      <w:r>
+        <w:rPr>
+          <w:b/>
           <w:color w:val="4F46E5"/>
           <w:sz w:val="23"/>
-          <w:szCs w:val="23"/>
-        </w:rPr>
-        <w:t>Placement is built in, not bolted on</w:t>
+        </w:rPr>
+        <w:t>Proctoring that actually catches cheating</w:t>
       </w:r>
     </w:p>
     <w:p>
@@ -384,48 +423,138 @@
           <w:sz w:val="21"/>
           <w:szCs w:val="21"/>
         </w:rPr>
-        <w:t>Drives, campaigns, and a dedicated company/recruiter portal live in the same system as the practice and testing tools — a student's readiness score and assessment history travel with them straight into the shortlisting pipeline.</w:t>
-      </w:r>
-    </w:p>
-    <w:p>
-      <w:pPr>
-        <w:spacing w:before="220" w:after="60"/>
-      </w:pPr>
-      <w:r>
-        <w:rPr>
-          <w:b/>
-          <w:bCs/>
+        <w:t xml:space="preserve">Live exams monitor for face-not-detected, multiple faces, face mismatch, tab switching, browser minimizing, copy-paste, right-click, screen sharing, </w:t>
+      </w:r>
+      <w:proofErr w:type="spellStart"/>
+      <w:r>
+        <w:rPr>
+          <w:color w:val="1E293B"/>
+          <w:sz w:val="21"/>
+          <w:szCs w:val="21"/>
+        </w:rPr>
+        <w:t>devtools</w:t>
+      </w:r>
+      <w:proofErr w:type="spellEnd"/>
+      <w:r>
+        <w:rPr>
+          <w:color w:val="1E293B"/>
+          <w:sz w:val="21"/>
+          <w:szCs w:val="21"/>
+        </w:rPr>
+        <w:t>, external displays, and network anomalies — each weighted into a per-student risk score the college can review, not a simple pass/fail flag.</w:t>
+      </w:r>
+    </w:p>
+    <w:p>
+      <w:pPr>
+        <w:pStyle w:val="Heading2"/>
+        <w:spacing w:before="200" w:after="80"/>
+        <w:rPr>
+          <w:b/>
           <w:color w:val="4F46E5"/>
           <w:sz w:val="23"/>
-          <w:szCs w:val="23"/>
-        </w:rPr>
-        <w:t>Adaptive, gamified daily practice</w:t>
-      </w:r>
-    </w:p>
-    <w:p>
-      <w:pPr>
-        <w:spacing w:after="140" w:line="300" w:lineRule="auto"/>
-      </w:pPr>
-      <w:r>
-        <w:rPr>
-          <w:color w:val="1E293B"/>
-          <w:sz w:val="21"/>
-          <w:szCs w:val="21"/>
-        </w:rPr>
-        <w:t>Personalized daily targets, streak tracking, and a readiness score keep students engaged between exams instead of cramming once a semester.</w:t>
-      </w:r>
-    </w:p>
-    <w:p>
-      <w:pPr>
-        <w:spacing w:before="220" w:after="60"/>
-      </w:pPr>
-      <w:r>
-        <w:rPr>
-          <w:b/>
-          <w:bCs/>
+        </w:rPr>
+      </w:pPr>
+      <w:r>
+        <w:rPr>
+          <w:b/>
           <w:color w:val="4F46E5"/>
           <w:sz w:val="23"/>
-          <w:szCs w:val="23"/>
+        </w:rPr>
+        <w:t>Voice AI mock interviews, not just MCQs</w:t>
+      </w:r>
+    </w:p>
+    <w:p>
+      <w:pPr>
+        <w:spacing w:after="140" w:line="300" w:lineRule="auto"/>
+      </w:pPr>
+      <w:r>
+        <w:rPr>
+          <w:color w:val="1E293B"/>
+          <w:sz w:val="21"/>
+          <w:szCs w:val="21"/>
+        </w:rPr>
+        <w:t>Students practice real spoken interviews with an AI interviewer and get structured feedback — the missing link between “scored well on the aptitude test” and “can perform in front of a recruiter.”</w:t>
+      </w:r>
+    </w:p>
+    <w:p>
+      <w:pPr>
+        <w:pStyle w:val="Heading2"/>
+        <w:spacing w:before="200" w:after="80"/>
+        <w:rPr>
+          <w:b/>
+          <w:color w:val="4F46E5"/>
+          <w:sz w:val="23"/>
+        </w:rPr>
+      </w:pPr>
+      <w:r>
+        <w:rPr>
+          <w:b/>
+          <w:color w:val="4F46E5"/>
+          <w:sz w:val="23"/>
+        </w:rPr>
+        <w:t>Placement is built in, not bolted on</w:t>
+      </w:r>
+    </w:p>
+    <w:p>
+      <w:pPr>
+        <w:spacing w:after="140" w:line="300" w:lineRule="auto"/>
+      </w:pPr>
+      <w:r>
+        <w:rPr>
+          <w:color w:val="1E293B"/>
+          <w:sz w:val="21"/>
+          <w:szCs w:val="21"/>
+        </w:rPr>
+        <w:t>Drives, campaigns, and a dedicated company/recruiter portal live in the same system as the practice and testing tools — a student's readiness score and assessment history travel with them straight into the shortlisting pipeline.</w:t>
+      </w:r>
+    </w:p>
+    <w:p>
+      <w:pPr>
+        <w:pStyle w:val="Heading2"/>
+        <w:spacing w:before="200" w:after="80"/>
+        <w:rPr>
+          <w:b/>
+          <w:color w:val="4F46E5"/>
+          <w:sz w:val="23"/>
+        </w:rPr>
+      </w:pPr>
+      <w:r>
+        <w:rPr>
+          <w:b/>
+          <w:color w:val="4F46E5"/>
+          <w:sz w:val="23"/>
+        </w:rPr>
+        <w:t>Adaptive, gamified daily practice</w:t>
+      </w:r>
+    </w:p>
+    <w:p>
+      <w:pPr>
+        <w:spacing w:after="140" w:line="300" w:lineRule="auto"/>
+      </w:pPr>
+      <w:r>
+        <w:rPr>
+          <w:color w:val="1E293B"/>
+          <w:sz w:val="21"/>
+          <w:szCs w:val="21"/>
+        </w:rPr>
+        <w:t>Personalized daily targets, streak tracking, and a readiness score keep students engaged between exams instead of cramming once a semester.</w:t>
+      </w:r>
+    </w:p>
+    <w:p>
+      <w:pPr>
+        <w:pStyle w:val="Heading2"/>
+        <w:spacing w:before="200" w:after="80"/>
+        <w:rPr>
+          <w:b/>
+          <w:color w:val="4F46E5"/>
+          <w:sz w:val="23"/>
+        </w:rPr>
+      </w:pPr>
+      <w:r>
+        <w:rPr>
+          <w:b/>
+          <w:color w:val="4F46E5"/>
+          <w:sz w:val="23"/>
         </w:rPr>
         <w:lastRenderedPageBreak/>
         <w:t>One flat price, everything included</w:t>
@@ -512,7 +641,25 @@
           <w:sz w:val="21"/>
           <w:szCs w:val="21"/>
         </w:rPr>
-        <w:t>Build and schedule assessment campaigns with configurable proctoring rules (fullscreen lock, tab-switch limits, copy-paste blocking).</w:t>
+        <w:t>Build and schedule assessment campaigns with configurable proctoring rules (</w:t>
+      </w:r>
+      <w:proofErr w:type="spellStart"/>
+      <w:r>
+        <w:rPr>
+          <w:color w:val="1E293B"/>
+          <w:sz w:val="21"/>
+          <w:szCs w:val="21"/>
+        </w:rPr>
+        <w:t>fullscreen</w:t>
+      </w:r>
+      <w:proofErr w:type="spellEnd"/>
+      <w:r>
+        <w:rPr>
+          <w:color w:val="1E293B"/>
+          <w:sz w:val="21"/>
+          <w:szCs w:val="21"/>
+        </w:rPr>
+        <w:t xml:space="preserve"> lock, tab-switch limits, copy-paste blocking).</w:t>
       </w:r>
     </w:p>
     <w:p>
@@ -548,7 +695,25 @@
           <w:sz w:val="21"/>
           <w:szCs w:val="21"/>
         </w:rPr>
-        <w:t>Track placement drives and communicate with students in-app.</w:t>
+        <w:t xml:space="preserve">Track placement drives and </w:t>
+      </w:r>
+      <w:proofErr w:type="gramStart"/>
+      <w:r>
+        <w:rPr>
+          <w:color w:val="1E293B"/>
+          <w:sz w:val="21"/>
+          <w:szCs w:val="21"/>
+        </w:rPr>
+        <w:t>communicate</w:t>
+      </w:r>
+      <w:proofErr w:type="gramEnd"/>
+      <w:r>
+        <w:rPr>
+          <w:color w:val="1E293B"/>
+          <w:sz w:val="21"/>
+          <w:szCs w:val="21"/>
+        </w:rPr>
+        <w:t xml:space="preserve"> with students in-app.</w:t>
       </w:r>
     </w:p>
     <w:p>
@@ -813,6 +978,12 @@
       </w:r>
     </w:p>
     <w:sectPr>
+      <w:headerReference w:type="even" r:id="rId7"/>
+      <w:headerReference w:type="default" r:id="rId8"/>
+      <w:footerReference w:type="even" r:id="rId9"/>
+      <w:footerReference w:type="default" r:id="rId10"/>
+      <w:headerReference w:type="first" r:id="rId11"/>
+      <w:footerReference w:type="first" r:id="rId12"/>
       <w:pgSz w:w="12240" w:h="15840"/>
       <w:pgMar w:top="900" w:right="1000" w:bottom="900" w:left="1000" w:header="708" w:footer="708" w:gutter="0"/>
       <w:cols w:space="720"/>
@@ -820,6 +991,104 @@
     </w:sectPr>
   </w:body>
 </w:document>
+</file>
+
+<file path=word/endnotes.xml><?xml version="1.0" encoding="utf-8"?>
+<w:endnotes xmlns:wpc="http://schemas.microsoft.com/office/word/2010/wordprocessingCanvas" xmlns:cx="http://schemas.microsoft.com/office/drawing/2014/chartex" xmlns:cx1="http://schemas.microsoft.com/office/drawing/2015/9/8/chartex" xmlns:cx2="http://schemas.microsoft.com/office/drawing/2015/10/21/chartex" xmlns:cx3="http://schemas.microsoft.com/office/drawing/2016/5/9/chartex" xmlns:cx4="http://schemas.microsoft.com/office/drawing/2016/5/10/chartex" xmlns:cx5="http://schemas.microsoft.com/office/drawing/2016/5/11/chartex" xmlns:cx6="http://schemas.microsoft.com/office/drawing/2016/5/12/chartex" xmlns:cx7="http://schemas.microsoft.com/office/drawing/2016/5/13/chartex" xmlns:cx8="http://schemas.microsoft.com/office/drawing/2016/5/14/chartex" xmlns:mc="http://schemas.openxmlformats.org/markup-compatibility/2006" xmlns:aink="http://schemas.microsoft.com/office/drawing/2016/ink" xmlns:am3d="http://schemas.microsoft.com/office/drawing/2017/model3d" xmlns:o="urn:schemas-microsoft-com:office:office" xmlns:oel="http://schemas.microsoft.com/office/2019/extlst" xmlns:r="http://schemas.openxmlformats.org/officeDocument/2006/relationships" xmlns:m="http://schemas.openxmlformats.org/officeDocument/2006/math" xmlns:v="urn:schemas-microsoft-com:vml" xmlns:wp14="http://schemas.microsoft.com/office/word/2010/wordprocessingDrawing" xmlns:wp="http://schemas.openxmlformats.org/drawingml/2006/wordprocessingDrawing" xmlns:w10="urn:schemas-microsoft-com:office:word" xmlns:w="http://schemas.openxmlformats.org/wordprocessingml/2006/main" xmlns:w14="http://schemas.microsoft.com/office/word/2010/wordml" xmlns:w15="http://schemas.microsoft.com/office/word/2012/wordml" xmlns:w16cex="http://schemas.microsoft.com/office/word/2018/wordml/cex" xmlns:w16cid="http://schemas.microsoft.com/office/word/2016/wordml/cid" xmlns:w16="http://schemas.microsoft.com/office/word/2018/wordml" xmlns:w16du="http://schemas.microsoft.com/office/word/2023/wordml/word16du" xmlns:w16sdtdh="http://schemas.microsoft.com/office/word/2020/wordml/sdtdatahash" xmlns:w16sdtfl="http://schemas.microsoft.com/office/word/2024/wordml/sdtformatlock" xmlns:w16se="http://schemas.microsoft.com/office/word/2015/wordml/symex" xmlns:wpg="http://schemas.microsoft.com/office/word/2010/wordprocessingGroup" xmlns:wpi="http://schemas.microsoft.com/office/word/2010/wordprocessingInk" xmlns:wne="http://schemas.microsoft.com/office/word/2006/wordml" xmlns:wps="http://schemas.microsoft.com/office/word/2010/wordprocessingShape" mc:Ignorable="w14 w15 w16se w16cid w16 w16cex w16sdtdh w16sdtfl w16du wp14">
+  <w:endnote w:type="separator" w:id="-1">
+    <w:p>
+      <w:r>
+        <w:separator/>
+      </w:r>
+    </w:p>
+  </w:endnote>
+  <w:endnote w:type="continuationSeparator" w:id="0">
+    <w:p>
+      <w:r>
+        <w:continuationSeparator/>
+      </w:r>
+    </w:p>
+  </w:endnote>
+</w:endnotes>
+</file>
+
+<file path=word/footer1.xml><?xml version="1.0" encoding="utf-8"?>
+<w:ftr xmlns:wpc="http://schemas.microsoft.com/office/word/2010/wordprocessingCanvas" xmlns:cx="http://schemas.microsoft.com/office/drawing/2014/chartex" xmlns:cx1="http://schemas.microsoft.com/office/drawing/2015/9/8/chartex" xmlns:cx2="http://schemas.microsoft.com/office/drawing/2015/10/21/chartex" xmlns:cx3="http://schemas.microsoft.com/office/drawing/2016/5/9/chartex" xmlns:cx4="http://schemas.microsoft.com/office/drawing/2016/5/10/chartex" xmlns:cx5="http://schemas.microsoft.com/office/drawing/2016/5/11/chartex" xmlns:cx6="http://schemas.microsoft.com/office/drawing/2016/5/12/chartex" xmlns:cx7="http://schemas.microsoft.com/office/drawing/2016/5/13/chartex" xmlns:cx8="http://schemas.microsoft.com/office/drawing/2016/5/14/chartex" xmlns:mc="http://schemas.openxmlformats.org/markup-compatibility/2006" xmlns:aink="http://schemas.microsoft.com/office/drawing/2016/ink" xmlns:am3d="http://schemas.microsoft.com/office/drawing/2017/model3d" xmlns:o="urn:schemas-microsoft-com:office:office" xmlns:oel="http://schemas.microsoft.com/office/2019/extlst" xmlns:r="http://schemas.openxmlformats.org/officeDocument/2006/relationships" xmlns:m="http://schemas.openxmlformats.org/officeDocument/2006/math" xmlns:v="urn:schemas-microsoft-com:vml" xmlns:wp14="http://schemas.microsoft.com/office/word/2010/wordprocessingDrawing" xmlns:wp="http://schemas.openxmlformats.org/drawingml/2006/wordprocessingDrawing" xmlns:w10="urn:schemas-microsoft-com:office:word" xmlns:w="http://schemas.openxmlformats.org/wordprocessingml/2006/main" xmlns:w14="http://schemas.microsoft.com/office/word/2010/wordml" xmlns:w15="http://schemas.microsoft.com/office/word/2012/wordml" xmlns:w16cex="http://schemas.microsoft.com/office/word/2018/wordml/cex" xmlns:w16cid="http://schemas.microsoft.com/office/word/2016/wordml/cid" xmlns:w16="http://schemas.microsoft.com/office/word/2018/wordml" xmlns:w16du="http://schemas.microsoft.com/office/word/2023/wordml/word16du" xmlns:w16sdtdh="http://schemas.microsoft.com/office/word/2020/wordml/sdtdatahash" xmlns:w16sdtfl="http://schemas.microsoft.com/office/word/2024/wordml/sdtformatlock" xmlns:w16se="http://schemas.microsoft.com/office/word/2015/wordml/symex" xmlns:wpg="http://schemas.microsoft.com/office/word/2010/wordprocessingGroup" xmlns:wpi="http://schemas.microsoft.com/office/word/2010/wordprocessingInk" xmlns:wne="http://schemas.microsoft.com/office/word/2006/wordml" xmlns:wps="http://schemas.microsoft.com/office/word/2010/wordprocessingShape" mc:Ignorable="w14 w15 w16se w16cid w16 w16cex w16sdtdh w16sdtfl w16du wp14">
+  <w:p>
+    <w:pPr>
+      <w:pStyle w:val="Footer"/>
+    </w:pPr>
+  </w:p>
+</w:ftr>
+</file>
+
+<file path=word/footer2.xml><?xml version="1.0" encoding="utf-8"?>
+<w:ftr xmlns:wpc="http://schemas.microsoft.com/office/word/2010/wordprocessingCanvas" xmlns:cx="http://schemas.microsoft.com/office/drawing/2014/chartex" xmlns:cx1="http://schemas.microsoft.com/office/drawing/2015/9/8/chartex" xmlns:cx2="http://schemas.microsoft.com/office/drawing/2015/10/21/chartex" xmlns:cx3="http://schemas.microsoft.com/office/drawing/2016/5/9/chartex" xmlns:cx4="http://schemas.microsoft.com/office/drawing/2016/5/10/chartex" xmlns:cx5="http://schemas.microsoft.com/office/drawing/2016/5/11/chartex" xmlns:cx6="http://schemas.microsoft.com/office/drawing/2016/5/12/chartex" xmlns:cx7="http://schemas.microsoft.com/office/drawing/2016/5/13/chartex" xmlns:cx8="http://schemas.microsoft.com/office/drawing/2016/5/14/chartex" xmlns:mc="http://schemas.openxmlformats.org/markup-compatibility/2006" xmlns:aink="http://schemas.microsoft.com/office/drawing/2016/ink" xmlns:am3d="http://schemas.microsoft.com/office/drawing/2017/model3d" xmlns:o="urn:schemas-microsoft-com:office:office" xmlns:oel="http://schemas.microsoft.com/office/2019/extlst" xmlns:r="http://schemas.openxmlformats.org/officeDocument/2006/relationships" xmlns:m="http://schemas.openxmlformats.org/officeDocument/2006/math" xmlns:v="urn:schemas-microsoft-com:vml" xmlns:wp14="http://schemas.microsoft.com/office/word/2010/wordprocessingDrawing" xmlns:wp="http://schemas.openxmlformats.org/drawingml/2006/wordprocessingDrawing" xmlns:w10="urn:schemas-microsoft-com:office:word" xmlns:w="http://schemas.openxmlformats.org/wordprocessingml/2006/main" xmlns:w14="http://schemas.microsoft.com/office/word/2010/wordml" xmlns:w15="http://schemas.microsoft.com/office/word/2012/wordml" xmlns:w16cex="http://schemas.microsoft.com/office/word/2018/wordml/cex" xmlns:w16cid="http://schemas.microsoft.com/office/word/2016/wordml/cid" xmlns:w16="http://schemas.microsoft.com/office/word/2018/wordml" xmlns:w16du="http://schemas.microsoft.com/office/word/2023/wordml/word16du" xmlns:w16sdtdh="http://schemas.microsoft.com/office/word/2020/wordml/sdtdatahash" xmlns:w16sdtfl="http://schemas.microsoft.com/office/word/2024/wordml/sdtformatlock" xmlns:w16se="http://schemas.microsoft.com/office/word/2015/wordml/symex" xmlns:wpg="http://schemas.microsoft.com/office/word/2010/wordprocessingGroup" xmlns:wpi="http://schemas.microsoft.com/office/word/2010/wordprocessingInk" xmlns:wne="http://schemas.microsoft.com/office/word/2006/wordml" xmlns:wps="http://schemas.microsoft.com/office/word/2010/wordprocessingShape" mc:Ignorable="w14 w15 w16se w16cid w16 w16cex w16sdtdh w16sdtfl w16du wp14">
+  <w:p>
+    <w:pPr>
+      <w:pStyle w:val="Footer"/>
+    </w:pPr>
+  </w:p>
+</w:ftr>
+</file>
+
+<file path=word/footer3.xml><?xml version="1.0" encoding="utf-8"?>
+<w:ftr xmlns:wpc="http://schemas.microsoft.com/office/word/2010/wordprocessingCanvas" xmlns:cx="http://schemas.microsoft.com/office/drawing/2014/chartex" xmlns:cx1="http://schemas.microsoft.com/office/drawing/2015/9/8/chartex" xmlns:cx2="http://schemas.microsoft.com/office/drawing/2015/10/21/chartex" xmlns:cx3="http://schemas.microsoft.com/office/drawing/2016/5/9/chartex" xmlns:cx4="http://schemas.microsoft.com/office/drawing/2016/5/10/chartex" xmlns:cx5="http://schemas.microsoft.com/office/drawing/2016/5/11/chartex" xmlns:cx6="http://schemas.microsoft.com/office/drawing/2016/5/12/chartex" xmlns:cx7="http://schemas.microsoft.com/office/drawing/2016/5/13/chartex" xmlns:cx8="http://schemas.microsoft.com/office/drawing/2016/5/14/chartex" xmlns:mc="http://schemas.openxmlformats.org/markup-compatibility/2006" xmlns:aink="http://schemas.microsoft.com/office/drawing/2016/ink" xmlns:am3d="http://schemas.microsoft.com/office/drawing/2017/model3d" xmlns:o="urn:schemas-microsoft-com:office:office" xmlns:oel="http://schemas.microsoft.com/office/2019/extlst" xmlns:r="http://schemas.openxmlformats.org/officeDocument/2006/relationships" xmlns:m="http://schemas.openxmlformats.org/officeDocument/2006/math" xmlns:v="urn:schemas-microsoft-com:vml" xmlns:wp14="http://schemas.microsoft.com/office/word/2010/wordprocessingDrawing" xmlns:wp="http://schemas.openxmlformats.org/drawingml/2006/wordprocessingDrawing" xmlns:w10="urn:schemas-microsoft-com:office:word" xmlns:w="http://schemas.openxmlformats.org/wordprocessingml/2006/main" xmlns:w14="http://schemas.microsoft.com/office/word/2010/wordml" xmlns:w15="http://schemas.microsoft.com/office/word/2012/wordml" xmlns:w16cex="http://schemas.microsoft.com/office/word/2018/wordml/cex" xmlns:w16cid="http://schemas.microsoft.com/office/word/2016/wordml/cid" xmlns:w16="http://schemas.microsoft.com/office/word/2018/wordml" xmlns:w16du="http://schemas.microsoft.com/office/word/2023/wordml/word16du" xmlns:w16sdtdh="http://schemas.microsoft.com/office/word/2020/wordml/sdtdatahash" xmlns:w16sdtfl="http://schemas.microsoft.com/office/word/2024/wordml/sdtformatlock" xmlns:w16se="http://schemas.microsoft.com/office/word/2015/wordml/symex" xmlns:wpg="http://schemas.microsoft.com/office/word/2010/wordprocessingGroup" xmlns:wpi="http://schemas.microsoft.com/office/word/2010/wordprocessingInk" xmlns:wne="http://schemas.microsoft.com/office/word/2006/wordml" xmlns:wps="http://schemas.microsoft.com/office/word/2010/wordprocessingShape" mc:Ignorable="w14 w15 w16se w16cid w16 w16cex w16sdtdh w16sdtfl w16du wp14">
+  <w:p>
+    <w:pPr>
+      <w:pStyle w:val="Footer"/>
+    </w:pPr>
+  </w:p>
+</w:ftr>
+</file>
+
+<file path=word/footnotes.xml><?xml version="1.0" encoding="utf-8"?>
+<w:footnotes xmlns:wpc="http://schemas.microsoft.com/office/word/2010/wordprocessingCanvas" xmlns:cx="http://schemas.microsoft.com/office/drawing/2014/chartex" xmlns:cx1="http://schemas.microsoft.com/office/drawing/2015/9/8/chartex" xmlns:cx2="http://schemas.microsoft.com/office/drawing/2015/10/21/chartex" xmlns:cx3="http://schemas.microsoft.com/office/drawing/2016/5/9/chartex" xmlns:cx4="http://schemas.microsoft.com/office/drawing/2016/5/10/chartex" xmlns:cx5="http://schemas.microsoft.com/office/drawing/2016/5/11/chartex" xmlns:cx6="http://schemas.microsoft.com/office/drawing/2016/5/12/chartex" xmlns:cx7="http://schemas.microsoft.com/office/drawing/2016/5/13/chartex" xmlns:cx8="http://schemas.microsoft.com/office/drawing/2016/5/14/chartex" xmlns:mc="http://schemas.openxmlformats.org/markup-compatibility/2006" xmlns:aink="http://schemas.microsoft.com/office/drawing/2016/ink" xmlns:am3d="http://schemas.microsoft.com/office/drawing/2017/model3d" xmlns:o="urn:schemas-microsoft-com:office:office" xmlns:oel="http://schemas.microsoft.com/office/2019/extlst" xmlns:r="http://schemas.openxmlformats.org/officeDocument/2006/relationships" xmlns:m="http://schemas.openxmlformats.org/officeDocument/2006/math" xmlns:v="urn:schemas-microsoft-com:vml" xmlns:wp14="http://schemas.microsoft.com/office/word/2010/wordprocessingDrawing" xmlns:wp="http://schemas.openxmlformats.org/drawingml/2006/wordprocessingDrawing" xmlns:w10="urn:schemas-microsoft-com:office:word" xmlns:w="http://schemas.openxmlformats.org/wordprocessingml/2006/main" xmlns:w14="http://schemas.microsoft.com/office/word/2010/wordml" xmlns:w15="http://schemas.microsoft.com/office/word/2012/wordml" xmlns:w16cex="http://schemas.microsoft.com/office/word/2018/wordml/cex" xmlns:w16cid="http://schemas.microsoft.com/office/word/2016/wordml/cid" xmlns:w16="http://schemas.microsoft.com/office/word/2018/wordml" xmlns:w16du="http://schemas.microsoft.com/office/word/2023/wordml/word16du" xmlns:w16sdtdh="http://schemas.microsoft.com/office/word/2020/wordml/sdtdatahash" xmlns:w16sdtfl="http://schemas.microsoft.com/office/word/2024/wordml/sdtformatlock" xmlns:w16se="http://schemas.microsoft.com/office/word/2015/wordml/symex" xmlns:wpg="http://schemas.microsoft.com/office/word/2010/wordprocessingGroup" xmlns:wpi="http://schemas.microsoft.com/office/word/2010/wordprocessingInk" xmlns:wne="http://schemas.microsoft.com/office/word/2006/wordml" xmlns:wps="http://schemas.microsoft.com/office/word/2010/wordprocessingShape" mc:Ignorable="w14 w15 w16se w16cid w16 w16cex w16sdtdh w16sdtfl w16du wp14">
+  <w:footnote w:type="separator" w:id="-1">
+    <w:p>
+      <w:r>
+        <w:separator/>
+      </w:r>
+    </w:p>
+  </w:footnote>
+  <w:footnote w:type="continuationSeparator" w:id="0">
+    <w:p>
+      <w:r>
+        <w:continuationSeparator/>
+      </w:r>
+    </w:p>
+  </w:footnote>
+</w:footnotes>
+</file>
+
+<file path=word/header1.xml><?xml version="1.0" encoding="utf-8"?>
+<w:hdr xmlns:wpc="http://schemas.microsoft.com/office/word/2010/wordprocessingCanvas" xmlns:cx="http://schemas.microsoft.com/office/drawing/2014/chartex" xmlns:cx1="http://schemas.microsoft.com/office/drawing/2015/9/8/chartex" xmlns:cx2="http://schemas.microsoft.com/office/drawing/2015/10/21/chartex" xmlns:cx3="http://schemas.microsoft.com/office/drawing/2016/5/9/chartex" xmlns:cx4="http://schemas.microsoft.com/office/drawing/2016/5/10/chartex" xmlns:cx5="http://schemas.microsoft.com/office/drawing/2016/5/11/chartex" xmlns:cx6="http://schemas.microsoft.com/office/drawing/2016/5/12/chartex" xmlns:cx7="http://schemas.microsoft.com/office/drawing/2016/5/13/chartex" xmlns:cx8="http://schemas.microsoft.com/office/drawing/2016/5/14/chartex" xmlns:mc="http://schemas.openxmlformats.org/markup-compatibility/2006" xmlns:aink="http://schemas.microsoft.com/office/drawing/2016/ink" xmlns:am3d="http://schemas.microsoft.com/office/drawing/2017/model3d" xmlns:o="urn:schemas-microsoft-com:office:office" xmlns:oel="http://schemas.microsoft.com/office/2019/extlst" xmlns:r="http://schemas.openxmlformats.org/officeDocument/2006/relationships" xmlns:m="http://schemas.openxmlformats.org/officeDocument/2006/math" xmlns:v="urn:schemas-microsoft-com:vml" xmlns:wp14="http://schemas.microsoft.com/office/word/2010/wordprocessingDrawing" xmlns:wp="http://schemas.openxmlformats.org/drawingml/2006/wordprocessingDrawing" xmlns:w10="urn:schemas-microsoft-com:office:word" xmlns:w="http://schemas.openxmlformats.org/wordprocessingml/2006/main" xmlns:w14="http://schemas.microsoft.com/office/word/2010/wordml" xmlns:w15="http://schemas.microsoft.com/office/word/2012/wordml" xmlns:w16cex="http://schemas.microsoft.com/office/word/2018/wordml/cex" xmlns:w16cid="http://schemas.microsoft.com/office/word/2016/wordml/cid" xmlns:w16="http://schemas.microsoft.com/office/word/2018/wordml" xmlns:w16du="http://schemas.microsoft.com/office/word/2023/wordml/word16du" xmlns:w16sdtdh="http://schemas.microsoft.com/office/word/2020/wordml/sdtdatahash" xmlns:w16sdtfl="http://schemas.microsoft.com/office/word/2024/wordml/sdtformatlock" xmlns:w16se="http://schemas.microsoft.com/office/word/2015/wordml/symex" xmlns:wpg="http://schemas.microsoft.com/office/word/2010/wordprocessingGroup" xmlns:wpi="http://schemas.microsoft.com/office/word/2010/wordprocessingInk" xmlns:wne="http://schemas.microsoft.com/office/word/2006/wordml" xmlns:wps="http://schemas.microsoft.com/office/word/2010/wordprocessingShape" mc:Ignorable="w14 w15 w16se w16cid w16 w16cex w16sdtdh w16sdtfl w16du wp14">
+  <w:p>
+    <w:pPr>
+      <w:pStyle w:val="Header"/>
+    </w:pPr>
+  </w:p>
+</w:hdr>
+</file>
+
+<file path=word/header2.xml><?xml version="1.0" encoding="utf-8"?>
+<w:hdr xmlns:wpc="http://schemas.microsoft.com/office/word/2010/wordprocessingCanvas" xmlns:cx="http://schemas.microsoft.com/office/drawing/2014/chartex" xmlns:cx1="http://schemas.microsoft.com/office/drawing/2015/9/8/chartex" xmlns:cx2="http://schemas.microsoft.com/office/drawing/2015/10/21/chartex" xmlns:cx3="http://schemas.microsoft.com/office/drawing/2016/5/9/chartex" xmlns:cx4="http://schemas.microsoft.com/office/drawing/2016/5/10/chartex" xmlns:cx5="http://schemas.microsoft.com/office/drawing/2016/5/11/chartex" xmlns:cx6="http://schemas.microsoft.com/office/drawing/2016/5/12/chartex" xmlns:cx7="http://schemas.microsoft.com/office/drawing/2016/5/13/chartex" xmlns:cx8="http://schemas.microsoft.com/office/drawing/2016/5/14/chartex" xmlns:mc="http://schemas.openxmlformats.org/markup-compatibility/2006" xmlns:aink="http://schemas.microsoft.com/office/drawing/2016/ink" xmlns:am3d="http://schemas.microsoft.com/office/drawing/2017/model3d" xmlns:o="urn:schemas-microsoft-com:office:office" xmlns:oel="http://schemas.microsoft.com/office/2019/extlst" xmlns:r="http://schemas.openxmlformats.org/officeDocument/2006/relationships" xmlns:m="http://schemas.openxmlformats.org/officeDocument/2006/math" xmlns:v="urn:schemas-microsoft-com:vml" xmlns:wp14="http://schemas.microsoft.com/office/word/2010/wordprocessingDrawing" xmlns:wp="http://schemas.openxmlformats.org/drawingml/2006/wordprocessingDrawing" xmlns:w10="urn:schemas-microsoft-com:office:word" xmlns:w="http://schemas.openxmlformats.org/wordprocessingml/2006/main" xmlns:w14="http://schemas.microsoft.com/office/word/2010/wordml" xmlns:w15="http://schemas.microsoft.com/office/word/2012/wordml" xmlns:w16cex="http://schemas.microsoft.com/office/word/2018/wordml/cex" xmlns:w16cid="http://schemas.microsoft.com/office/word/2016/wordml/cid" xmlns:w16="http://schemas.microsoft.com/office/word/2018/wordml" xmlns:w16du="http://schemas.microsoft.com/office/word/2023/wordml/word16du" xmlns:w16sdtdh="http://schemas.microsoft.com/office/word/2020/wordml/sdtdatahash" xmlns:w16sdtfl="http://schemas.microsoft.com/office/word/2024/wordml/sdtformatlock" xmlns:w16se="http://schemas.microsoft.com/office/word/2015/wordml/symex" xmlns:wpg="http://schemas.microsoft.com/office/word/2010/wordprocessingGroup" xmlns:wpi="http://schemas.microsoft.com/office/word/2010/wordprocessingInk" xmlns:wne="http://schemas.microsoft.com/office/word/2006/wordml" xmlns:wps="http://schemas.microsoft.com/office/word/2010/wordprocessingShape" mc:Ignorable="w14 w15 w16se w16cid w16 w16cex w16sdtdh w16sdtfl w16du wp14">
+  <w:p>
+    <w:pPr>
+      <w:pStyle w:val="Header"/>
+    </w:pPr>
+  </w:p>
+</w:hdr>
+</file>
+
+<file path=word/header3.xml><?xml version="1.0" encoding="utf-8"?>
+<w:hdr xmlns:wpc="http://schemas.microsoft.com/office/word/2010/wordprocessingCanvas" xmlns:cx="http://schemas.microsoft.com/office/drawing/2014/chartex" xmlns:cx1="http://schemas.microsoft.com/office/drawing/2015/9/8/chartex" xmlns:cx2="http://schemas.microsoft.com/office/drawing/2015/10/21/chartex" xmlns:cx3="http://schemas.microsoft.com/office/drawing/2016/5/9/chartex" xmlns:cx4="http://schemas.microsoft.com/office/drawing/2016/5/10/chartex" xmlns:cx5="http://schemas.microsoft.com/office/drawing/2016/5/11/chartex" xmlns:cx6="http://schemas.microsoft.com/office/drawing/2016/5/12/chartex" xmlns:cx7="http://schemas.microsoft.com/office/drawing/2016/5/13/chartex" xmlns:cx8="http://schemas.microsoft.com/office/drawing/2016/5/14/chartex" xmlns:mc="http://schemas.openxmlformats.org/markup-compatibility/2006" xmlns:aink="http://schemas.microsoft.com/office/drawing/2016/ink" xmlns:am3d="http://schemas.microsoft.com/office/drawing/2017/model3d" xmlns:o="urn:schemas-microsoft-com:office:office" xmlns:oel="http://schemas.microsoft.com/office/2019/extlst" xmlns:r="http://schemas.openxmlformats.org/officeDocument/2006/relationships" xmlns:m="http://schemas.openxmlformats.org/officeDocument/2006/math" xmlns:v="urn:schemas-microsoft-com:vml" xmlns:wp14="http://schemas.microsoft.com/office/word/2010/wordprocessingDrawing" xmlns:wp="http://schemas.openxmlformats.org/drawingml/2006/wordprocessingDrawing" xmlns:w10="urn:schemas-microsoft-com:office:word" xmlns:w="http://schemas.openxmlformats.org/wordprocessingml/2006/main" xmlns:w14="http://schemas.microsoft.com/office/word/2010/wordml" xmlns:w15="http://schemas.microsoft.com/office/word/2012/wordml" xmlns:w16cex="http://schemas.microsoft.com/office/word/2018/wordml/cex" xmlns:w16cid="http://schemas.microsoft.com/office/word/2016/wordml/cid" xmlns:w16="http://schemas.microsoft.com/office/word/2018/wordml" xmlns:w16du="http://schemas.microsoft.com/office/word/2023/wordml/word16du" xmlns:w16sdtdh="http://schemas.microsoft.com/office/word/2020/wordml/sdtdatahash" xmlns:w16sdtfl="http://schemas.microsoft.com/office/word/2024/wordml/sdtformatlock" xmlns:w16se="http://schemas.microsoft.com/office/word/2015/wordml/symex" xmlns:wpg="http://schemas.microsoft.com/office/word/2010/wordprocessingGroup" xmlns:wpi="http://schemas.microsoft.com/office/word/2010/wordprocessingInk" xmlns:wne="http://schemas.microsoft.com/office/word/2006/wordml" xmlns:wps="http://schemas.microsoft.com/office/word/2010/wordprocessingShape" mc:Ignorable="w14 w15 w16se w16cid w16 w16cex w16sdtdh w16sdtfl w16du wp14">
+  <w:p>
+    <w:pPr>
+      <w:pStyle w:val="Header"/>
+    </w:pPr>
+  </w:p>
+</w:hdr>
 </file>
 
 <file path=word/numbering.xml><?xml version="1.0" encoding="utf-8"?>
@@ -1391,6 +1660,7 @@
     <w:unhideWhenUsed/>
     <w:qFormat/>
     <w:pPr>
+      <w:keepNext/>
       <w:outlineLvl w:val="1"/>
     </w:pPr>
     <w:rPr>
@@ -1565,6 +1835,48 @@
       <w:sz w:val="20"/>
       <w:szCs w:val="20"/>
     </w:rPr>
+  </w:style>
+  <w:style w:type="paragraph" w:styleId="Header">
+    <w:name w:val="header"/>
+    <w:basedOn w:val="Normal"/>
+    <w:link w:val="HeaderChar"/>
+    <w:uiPriority w:val="99"/>
+    <w:unhideWhenUsed/>
+    <w:rsid w:val="00F80141"/>
+    <w:pPr>
+      <w:tabs>
+        <w:tab w:val="center" w:pos="4680"/>
+        <w:tab w:val="right" w:pos="9360"/>
+      </w:tabs>
+    </w:pPr>
+  </w:style>
+  <w:style w:type="character" w:customStyle="1" w:styleId="HeaderChar">
+    <w:name w:val="Header Char"/>
+    <w:basedOn w:val="DefaultParagraphFont"/>
+    <w:link w:val="Header"/>
+    <w:uiPriority w:val="99"/>
+    <w:rsid w:val="00F80141"/>
+  </w:style>
+  <w:style w:type="paragraph" w:styleId="Footer">
+    <w:name w:val="footer"/>
+    <w:basedOn w:val="Normal"/>
+    <w:link w:val="FooterChar"/>
+    <w:uiPriority w:val="99"/>
+    <w:unhideWhenUsed/>
+    <w:rsid w:val="00F80141"/>
+    <w:pPr>
+      <w:tabs>
+        <w:tab w:val="center" w:pos="4680"/>
+        <w:tab w:val="right" w:pos="9360"/>
+      </w:tabs>
+    </w:pPr>
+  </w:style>
+  <w:style w:type="character" w:customStyle="1" w:styleId="FooterChar">
+    <w:name w:val="Footer Char"/>
+    <w:basedOn w:val="DefaultParagraphFont"/>
+    <w:link w:val="Footer"/>
+    <w:uiPriority w:val="99"/>
+    <w:rsid w:val="00F80141"/>
   </w:style>
 </w:styles>
 </file>
@@ -1862,4 +2174,26 @@
     </a:ext>
   </a:extLst>
 </a:theme>
+</file>
+
+<file path=word/webextensions/taskpanes.xml><?xml version="1.0" encoding="utf-8"?>
+<wetp:taskpanes xmlns:wetp="http://schemas.microsoft.com/office/webextensions/taskpanes/2010/11">
+  <wetp:taskpane dockstate="right" visibility="0" width="438" row="0">
+    <wetp:webextensionref xmlns:r="http://schemas.openxmlformats.org/officeDocument/2006/relationships" r:id="rId1"/>
+  </wetp:taskpane>
+</wetp:taskpanes>
+</file>
+
+<file path=word/webextensions/webextension1.xml><?xml version="1.0" encoding="utf-8"?>
+<we:webextension xmlns:we="http://schemas.microsoft.com/office/webextensions/webextension/2010/11" id="{FBCEB350-CBF6-446D-AEFE-093BD03DA02F}">
+  <we:reference id="wa200010453" version="1.0.0.1" store="en-US" storeType="OMEX"/>
+  <we:alternateReferences>
+    <we:reference id="wa200010453" version="1.0.0.1" store="" storeType="OMEX"/>
+  </we:alternateReferences>
+  <we:properties>
+    <we:property name="claude.fileId" value="&quot;fda25248-0d27-49af-ac78-def9655c9f78&quot;"/>
+  </we:properties>
+  <we:bindings/>
+  <we:snapshot xmlns:r="http://schemas.openxmlformats.org/officeDocument/2006/relationships"/>
+</we:webextension>
 </file>
</xml_diff>